<commit_message>
chore: final touches (stored procedure, tests, Docker setup, updated docs)
</commit_message>
<xml_diff>
--- a/docs/SubShift_Project_Proposal.docx
+++ b/docs/SubShift_Project_Proposal.docx
@@ -105,7 +105,7 @@
         <w:spacing w:after="150"/>
       </w:pPr>
       <w:r>
-        <w:t>Most people don't notice when a recurring subscription (OTT, music, cloud storage, gym, SaaS) quietly raises its price on renewal. Renewal and payment-confirmation emails pile up unread, and there is no lightweight way to track how much a subscription has actually cost over time, or to catch a price increase the moment it happens. SubShift addresses this by automatically detecting subscription-related emails in a user's Gmail, extracting the service, price, and date, and building a price history per subscription — flagging any renewal priced higher than the last recorded payment.</w:t>
+        <w:t>Most people don't notice when a recurring subscription (OTT, music, cloud storage, gym, SaaS) quietly raises its price on renewal. Renewal and payment-confirmation emails pile up unread, and there is no lightweight way to track how much a subscription has actually cost over time, or to catch a price increase the moment it happens. SubShift addresses this by automatically detecting subscription-related emails in a user's mailbox (Gmail, Outlook or Yahoo Mail), extracting the service, price, and date, and building a price history per subscription — flagging any renewal priced higher or lower than the last recorded payment and alerting the user in the app and by email.</w:t>
       </w:r>
     </w:p>
     <w:p>
@@ -205,24 +205,7 @@
         <w:spacing w:after="80"/>
       </w:pPr>
       <w:r>
-        <w:t>Enforce role-based access control so admin-only actions (managing services/categories) are protected.</w:t>
-      </w:r>
-    </w:p>
-    <w:p>
-      <w:pPr>
-        <w:pStyle w:val="Heading1"/>
-        <w:spacing w:before="300" w:after="150"/>
-      </w:pPr>
-      <w:r>
-        <w:t>3. Scope</w:t>
-      </w:r>
-    </w:p>
-    <w:p>
-      <w:pPr>
-        <w:spacing w:after="150"/>
-      </w:pPr>
-      <w:r>
-        <w:t>In scope for this project:</w:t>
+        <w:t>Support Gmail, Outlook and Yahoo Mail connections, and send price-change alerts over SMTP as well as inside the app.</w:t>
       </w:r>
     </w:p>
     <w:p>
@@ -235,7 +218,7 @@
         <w:spacing w:after="80"/>
       </w:pPr>
       <w:r>
-        <w:t>Read-only Gmail integration (gmail.readonly) for a single connected account per user.</w:t>
+        <w:t>Train and evaluate every machine-learning model on real data only, with no synthetic data.</w:t>
       </w:r>
     </w:p>
     <w:p>
@@ -248,7 +231,24 @@
         <w:spacing w:after="80"/>
       </w:pPr>
       <w:r>
-        <w:t>Email classification, LLM-based extraction, price-hike detection, price prediction, and spend clustering.</w:t>
+        <w:t>Enforce role-based access control so admin-only actions (managing services/categories) are protected.</w:t>
+      </w:r>
+    </w:p>
+    <w:p>
+      <w:pPr>
+        <w:pStyle w:val="Heading1"/>
+        <w:spacing w:before="300" w:after="150"/>
+      </w:pPr>
+      <w:r>
+        <w:t>3. Scope</w:t>
+      </w:r>
+    </w:p>
+    <w:p>
+      <w:pPr>
+        <w:spacing w:after="150"/>
+      </w:pPr>
+      <w:r>
+        <w:t>In scope for this project:</w:t>
       </w:r>
     </w:p>
     <w:p>
@@ -261,7 +261,7 @@
         <w:spacing w:after="80"/>
       </w:pPr>
       <w:r>
-        <w:t>A React dashboard covering subscriptions, price history, alerts, notifications, manual entry, and an admin panel.</w:t>
+        <w:t>Read-only mailbox integration (Gmail, Outlook or Yahoo Mail) with one connected mailbox per user.</w:t>
       </w:r>
     </w:p>
     <w:p>
@@ -274,15 +274,7 @@
         <w:spacing w:after="80"/>
       </w:pPr>
       <w:r>
-        <w:t>JWT-based authentication with two roles: USER and ADMIN.</w:t>
-      </w:r>
-    </w:p>
-    <w:p>
-      <w:pPr>
-        <w:spacing w:after="150"/>
-      </w:pPr>
-      <w:r>
-        <w:t>Out of scope:</w:t>
+        <w:t>Email classification, LLM-based extraction, price-change (hike and drop) detection, price forecasting, and spend clustering.</w:t>
       </w:r>
     </w:p>
     <w:p>
@@ -295,7 +287,54 @@
         <w:spacing w:after="80"/>
       </w:pPr>
       <w:r>
-        <w:t>Multi-account or multi-provider email support (Outlook, Yahoo, etc.).</w:t>
+        <w:t>A React dashboard covering subscriptions, price history, alerts, notifications, manual entry, and an admin panel.</w:t>
+      </w:r>
+    </w:p>
+    <w:p>
+      <w:pPr>
+        <w:pStyle w:val="ListParagraph"/>
+        <w:numPr>
+          <w:ilvl w:val="0"/>
+          <w:numId w:val="1"/>
+        </w:numPr>
+        <w:spacing w:after="80"/>
+      </w:pPr>
+      <w:r>
+        <w:t>JWT-based authentication with two roles: USER and ADMIN.</w:t>
+      </w:r>
+    </w:p>
+    <w:p>
+      <w:pPr>
+        <w:pStyle w:val="ListParagraph"/>
+        <w:numPr>
+          <w:ilvl w:val="0"/>
+          <w:numId w:val="1"/>
+        </w:numPr>
+        <w:spacing w:after="80"/>
+      </w:pPr>
+      <w:r>
+        <w:t>Alert emails over SMTP for price changes and possible cancellations, which each user can switch off.</w:t>
+      </w:r>
+    </w:p>
+    <w:p>
+      <w:pPr>
+        <w:spacing w:after="150"/>
+      </w:pPr>
+      <w:r>
+        <w:t>Out of scope:</w:t>
+      </w:r>
+    </w:p>
+    <w:p>
+      <w:pPr>
+        <w:pStyle w:val="ListParagraph"/>
+        <w:numPr>
+          <w:ilvl w:val="0"/>
+          <w:numId w:val="1"/>
+        </w:numPr>
+        <w:spacing w:after="80"/>
+      </w:pPr>
+      <w:r>
+        <w:t>Connecting more than one mailbox per user.</w:t>
       </w:r>
     </w:p>
     <w:p>
@@ -847,7 +886,7 @@
           </w:tcPr>
           <w:p>
             <w:r>
-              <w:t>Gmail API (gmail.readonly scope)</w:t>
+              <w:t>Gmail API (gmail.readonly), Microsoft Graph (Outlook, Mail.Read), IMAP with an app password (Yahoo Mail)</w:t>
             </w:r>
           </w:p>
         </w:tc>
@@ -927,7 +966,7 @@
           </w:tcPr>
           <w:p>
             <w:r>
-              <w:t>Logistic regression / Naive Bayes (email classifier), linear regression (price prediction), K-means (spend clustering)</w:t>
+              <w:t>TF-IDF with logistic regression / Naive Bayes (email classifier), ridge regression (price forecast), K-means (spend clustering), all written in plain Java</w:t>
             </w:r>
           </w:p>
         </w:tc>
@@ -967,7 +1006,47 @@
           </w:tcPr>
           <w:p>
             <w:r>
-              <w:t>Backend: Render or Railway (PostgreSQL add-on). Frontend: Netlify or Vercel</w:t>
+              <w:t>Backend and PostgreSQL database: Render (Docker image). Frontend: Vercel</w:t>
+            </w:r>
+          </w:p>
+        </w:tc>
+      </w:tr>
+      <w:tr>
+        <w:tblPrEx>
+          <w:tblCellMar>
+            <w:top w:w="0" w:type="dxa"/>
+            <w:bottom w:w="0" w:type="dxa"/>
+          </w:tblCellMar>
+        </w:tblPrEx>
+        <w:tc>
+          <w:tcPr>
+            <w:tcW w:w="2400" w:type="dxa"/>
+            <w:tcMar>
+              <w:top w:w="80" w:type="dxa"/>
+              <w:left w:w="100" w:type="dxa"/>
+              <w:bottom w:w="80" w:type="dxa"/>
+              <w:right w:w="100" w:type="dxa"/>
+            </w:tcMar>
+          </w:tcPr>
+          <w:p>
+            <w:r>
+              <w:t>Containers, tests and CI</w:t>
+            </w:r>
+          </w:p>
+        </w:tc>
+        <w:tc>
+          <w:tcPr>
+            <w:tcW w:w="6960" w:type="dxa"/>
+            <w:tcMar>
+              <w:top w:w="80" w:type="dxa"/>
+              <w:left w:w="100" w:type="dxa"/>
+              <w:bottom w:w="80" w:type="dxa"/>
+              <w:right w:w="100" w:type="dxa"/>
+            </w:tcMar>
+          </w:tcPr>
+          <w:p>
+            <w:r>
+              <w:t>Docker and Docker Compose; JUnit 5 and SQL tests; GitHub Actions</w:t>
             </w:r>
           </w:p>
         </w:tc>
@@ -1168,7 +1247,7 @@
           </w:tcPr>
           <w:p>
             <w:r>
-              <w:t>Spend clustering + insights page; cancellation detection; production deployment (backend + frontend); responsive UI; finalized docs and submission report</w:t>
+              <w:t>Spend clustering + insights page; cancellation detection; production deployment (backend + frontend); responsive UI; finalized docs and submission report; Docker image and Docker Compose setup; automated unit and database tests; GitHub Actions CI</w:t>
             </w:r>
           </w:p>
         </w:tc>
@@ -2290,7 +2369,7 @@
           </w:tcPr>
           <w:p>
             <w:r>
-              <w:t>Price prediction model + reporting view/proc</w:t>
+              <w:t>Price forecast model + reporting view and stored procedure</w:t>
             </w:r>
           </w:p>
         </w:tc>
@@ -2538,7 +2617,7 @@
           </w:tcPr>
           <w:p>
             <w:r>
-              <w:t>Deployment config, secrets audit, bonus items</w:t>
+              <w:t>Docker, deployment config, tests, CI, secrets audit</w:t>
             </w:r>
           </w:p>
         </w:tc>

</xml_diff>